<commit_message>
r programming lab assignment 03
</commit_message>
<xml_diff>
--- a/Lab/R-Lab-01/R-DP.docx
+++ b/Lab/R-Lab-01/R-DP.docx
@@ -61,7 +61,7 @@
         <w:rPr>
           <w:lang w:val="en-IN"/>
         </w:rPr>
-        <w:t>1</w:t>
+        <w:t>3</w:t>
       </w:r>
     </w:p>
     <w:p>
@@ -249,7 +249,19 @@
         <w:rPr>
           <w:lang w:val="en-IN"/>
         </w:rPr>
-        <w:t>Date: 1/0</w:t>
+        <w:t xml:space="preserve">Date: </w:t>
+      </w:r>
+      <w:r>
+        <w:rPr>
+          <w:lang w:val="en-IN"/>
+        </w:rPr>
+        <w:t>22</w:t>
+      </w:r>
+      <w:r>
+        <w:rPr>
+          <w:lang w:val="en-IN"/>
+        </w:rPr>
+        <w:t>/0</w:t>
       </w:r>
       <w:r>
         <w:rPr>

</xml_diff>